<commit_message>
feat(invoice): template with direct table formatting; drop the LibreOffice table workaround
The invoice template no longer relies on the Light List table style's banded
rules, so Word and LibreOffice draw the table the same way. Remove the
pre-processing added in #68 (and its tests); PDF conversion is back to plain
LibreOffice with the private profile.

Co-Authored-By: Claude Sonnet 5.5 <noreply@anthropic.com>
</commit_message>
<xml_diff>
--- a/docs/templates/us_invoice_template.docx
+++ b/docs/templates/us_invoice_template.docx
@@ -1,6 +1,6 @@
 
 <file path=word/document.xml><?xml version="1.0" encoding="utf-8"?>
-<w:document xmlns:wpc="http://schemas.microsoft.com/office/word/2010/wordprocessingCanvas" xmlns:cx="http://schemas.microsoft.com/office/drawing/2014/chartex" xmlns:cx1="http://schemas.microsoft.com/office/drawing/2015/9/8/chartex" xmlns:cx2="http://schemas.microsoft.com/office/drawing/2015/10/21/chartex" xmlns:cx3="http://schemas.microsoft.com/office/drawing/2016/5/9/chartex" xmlns:cx4="http://schemas.microsoft.com/office/drawing/2016/5/10/chartex" xmlns:cx5="http://schemas.microsoft.com/office/drawing/2016/5/11/chartex" xmlns:cx6="http://schemas.microsoft.com/office/drawing/2016/5/12/chartex" xmlns:cx7="http://schemas.microsoft.com/office/drawing/2016/5/13/chartex" xmlns:cx8="http://schemas.microsoft.com/office/drawing/2016/5/14/chartex" xmlns:mc="http://schemas.openxmlformats.org/markup-compatibility/2006" xmlns:aink="http://schemas.microsoft.com/office/drawing/2016/ink" xmlns:am3d="http://schemas.microsoft.com/office/drawing/2017/model3d" xmlns:o="urn:schemas-microsoft-com:office:office" xmlns:oel="http://schemas.microsoft.com/office/2019/extlst" xmlns:r="http://schemas.openxmlformats.org/officeDocument/2006/relationships" xmlns:m="http://schemas.openxmlformats.org/officeDocument/2006/math" xmlns:v="urn:schemas-microsoft-com:vml" xmlns:wp14="http://schemas.microsoft.com/office/word/2010/wordprocessingDrawing" xmlns:wp="http://schemas.openxmlformats.org/drawingml/2006/wordprocessingDrawing" xmlns:w10="urn:schemas-microsoft-com:office:word" xmlns:w="http://schemas.openxmlformats.org/wordprocessingml/2006/main" xmlns:w14="http://schemas.microsoft.com/office/word/2010/wordml" xmlns:w15="http://schemas.microsoft.com/office/word/2012/wordml" xmlns:w16cei="http://schemas.microsoft.com/office/word/2026/wordml/cei" xmlns:w16cex="http://schemas.microsoft.com/office/word/2018/wordml/cex" xmlns:w16cid="http://schemas.microsoft.com/office/word/2016/wordml/cid" xmlns:w16="http://schemas.microsoft.com/office/word/2018/wordml" xmlns:w16du="http://schemas.microsoft.com/office/word/2023/wordml/word16du" xmlns:w16sdtdh="http://schemas.microsoft.com/office/word/2020/wordml/sdtdatahash" xmlns:w16sdtfl="http://schemas.microsoft.com/office/word/2024/wordml/sdtformatlock" xmlns:w16se="http://schemas.microsoft.com/office/word/2015/wordml/symex" xmlns:wpg="http://schemas.microsoft.com/office/word/2010/wordprocessingGroup" xmlns:wpi="http://schemas.microsoft.com/office/word/2010/wordprocessingInk" xmlns:wne="http://schemas.microsoft.com/office/word/2006/wordml" xmlns:wps="http://schemas.microsoft.com/office/word/2010/wordprocessingShape" mc:Ignorable="w14 w15 w16se w16cid w16 w16cex w16sdtdh w16sdtfl w16du wp14">
+<w:document xmlns:wpc="http://schemas.microsoft.com/office/word/2010/wordprocessingCanvas" xmlns:cx="http://schemas.microsoft.com/office/drawing/2014/chartex" xmlns:cx1="http://schemas.microsoft.com/office/drawing/2015/9/8/chartex" xmlns:cx2="http://schemas.microsoft.com/office/drawing/2015/10/21/chartex" xmlns:cx3="http://schemas.microsoft.com/office/drawing/2016/5/9/chartex" xmlns:cx4="http://schemas.microsoft.com/office/drawing/2016/5/10/chartex" xmlns:cx5="http://schemas.microsoft.com/office/drawing/2016/5/11/chartex" xmlns:cx6="http://schemas.microsoft.com/office/drawing/2016/5/12/chartex" xmlns:cx7="http://schemas.microsoft.com/office/drawing/2016/5/13/chartex" xmlns:cx8="http://schemas.microsoft.com/office/drawing/2016/5/14/chartex" xmlns:mc="http://schemas.openxmlformats.org/markup-compatibility/2006" xmlns:aink="http://schemas.microsoft.com/office/drawing/2016/ink" xmlns:am3d="http://schemas.microsoft.com/office/drawing/2017/model3d" xmlns:o="urn:schemas-microsoft-com:office:office" xmlns:oel="http://schemas.microsoft.com/office/2019/extlst" xmlns:r="http://schemas.openxmlformats.org/officeDocument/2006/relationships" xmlns:m="http://schemas.openxmlformats.org/officeDocument/2006/math" xmlns:v="urn:schemas-microsoft-com:vml" xmlns:wp14="http://schemas.microsoft.com/office/word/2010/wordprocessingDrawing" xmlns:wp="http://schemas.openxmlformats.org/drawingml/2006/wordprocessingDrawing" xmlns:w10="urn:schemas-microsoft-com:office:word" xmlns:w="http://schemas.openxmlformats.org/wordprocessingml/2006/main" xmlns:w14="http://schemas.microsoft.com/office/word/2010/wordml" xmlns:w15="http://schemas.microsoft.com/office/word/2012/wordml" xmlns:w16cex="http://schemas.microsoft.com/office/word/2018/wordml/cex" xmlns:w16cid="http://schemas.microsoft.com/office/word/2016/wordml/cid" xmlns:w16="http://schemas.microsoft.com/office/word/2018/wordml" xmlns:w16du="http://schemas.microsoft.com/office/word/2023/wordml/word16du" xmlns:w16sdtdh="http://schemas.microsoft.com/office/word/2020/wordml/sdtdatahash" xmlns:w16sdtfl="http://schemas.microsoft.com/office/word/2024/wordml/sdtformatlock" xmlns:w16se="http://schemas.microsoft.com/office/word/2015/wordml/symex" xmlns:wpg="http://schemas.microsoft.com/office/word/2010/wordprocessingGroup" xmlns:wpi="http://schemas.microsoft.com/office/word/2010/wordprocessingInk" xmlns:wne="http://schemas.microsoft.com/office/word/2006/wordml" xmlns:wps="http://schemas.microsoft.com/office/word/2010/wordprocessingShape" mc:Ignorable="w14 w15 w16se w16cid w16 w16cex w16sdtdh w16sdtfl w16du wp14">
   <w:body>
     <w:p>
       <w:pPr>
@@ -328,28 +328,42 @@
     <w:p/>
     <w:tbl>
       <w:tblPr>
-        <w:tblStyle w:val="LightList-Accent1"/>
         <w:tblW w:w="0" w:type="auto"/>
+        <w:tblBorders>
+          <w:top w:val="single" w:sz="12" w:space="0" w:color="4F81BD"/>
+          <w:left w:val="single" w:sz="12" w:space="0" w:color="4F81BD"/>
+          <w:bottom w:val="single" w:sz="12" w:space="0" w:color="4F81BD"/>
+          <w:right w:val="single" w:sz="12" w:space="0" w:color="4F81BD"/>
+        </w:tblBorders>
         <w:tblLook w:val="04A0" w:firstRow="1" w:lastRow="0" w:firstColumn="1" w:lastColumn="0" w:noHBand="0" w:noVBand="1"/>
       </w:tblPr>
       <w:tblGrid>
-        <w:gridCol w:w="5660"/>
+        <w:gridCol w:w="5654"/>
         <w:gridCol w:w="360"/>
-        <w:gridCol w:w="1381"/>
+        <w:gridCol w:w="1379"/>
         <w:gridCol w:w="59"/>
-        <w:gridCol w:w="2600"/>
+        <w:gridCol w:w="2598"/>
       </w:tblGrid>
       <w:tr>
-        <w:trPr>
-          <w:cnfStyle w:val="100000000000" w:firstRow="1" w:lastRow="0" w:firstColumn="0" w:lastColumn="0" w:oddVBand="0" w:evenVBand="0" w:oddHBand="0" w:evenHBand="0" w:firstRowFirstColumn="0" w:firstRowLastColumn="0" w:lastRowFirstColumn="0" w:lastRowLastColumn="0"/>
-        </w:trPr>
         <w:tc>
           <w:tcPr>
-            <w:cnfStyle w:val="001000000000" w:firstRow="0" w:lastRow="0" w:firstColumn="1" w:lastColumn="0" w:oddVBand="0" w:evenVBand="0" w:oddHBand="0" w:evenHBand="0" w:firstRowFirstColumn="0" w:firstRowLastColumn="0" w:lastRowFirstColumn="0" w:lastRowLastColumn="0"/>
             <w:tcW w:w="5660" w:type="dxa"/>
+            <w:shd w:val="clear" w:color="auto" w:fill="4F81BD"/>
           </w:tcPr>
           <w:p>
-            <w:r>
+            <w:pPr>
+              <w:rPr>
+                <w:b/>
+                <w:bCs/>
+                <w:color w:val="FFFFFF" w:themeColor="background1"/>
+              </w:rPr>
+            </w:pPr>
+            <w:r>
+              <w:rPr>
+                <w:b/>
+                <w:bCs/>
+                <w:color w:val="FFFFFF" w:themeColor="background1"/>
+              </w:rPr>
               <w:t>Name</w:t>
             </w:r>
           </w:p>
@@ -358,12 +372,15 @@
           <w:tcPr>
             <w:tcW w:w="1741" w:type="dxa"/>
             <w:gridSpan w:val="2"/>
+            <w:shd w:val="clear" w:color="auto" w:fill="4F81BD"/>
           </w:tcPr>
           <w:p>
             <w:pPr>
               <w:jc w:val="right"/>
-              <w:cnfStyle w:val="100000000000" w:firstRow="1" w:lastRow="0" w:firstColumn="0" w:lastColumn="0" w:oddVBand="0" w:evenVBand="0" w:oddHBand="0" w:evenHBand="0" w:firstRowFirstColumn="0" w:firstRowLastColumn="0" w:lastRowFirstColumn="0" w:lastRowLastColumn="0"/>
               <w:rPr>
+                <w:b/>
+                <w:bCs/>
+                <w:color w:val="FFFFFF" w:themeColor="background1"/>
                 <w:sz w:val="20"/>
                 <w:szCs w:val="14"/>
               </w:rPr>
@@ -374,13 +391,23 @@
           <w:tcPr>
             <w:tcW w:w="2659" w:type="dxa"/>
             <w:gridSpan w:val="2"/>
+            <w:shd w:val="clear" w:color="auto" w:fill="4F81BD"/>
           </w:tcPr>
           <w:p>
             <w:pPr>
               <w:jc w:val="right"/>
-              <w:cnfStyle w:val="100000000000" w:firstRow="1" w:lastRow="0" w:firstColumn="0" w:lastColumn="0" w:oddVBand="0" w:evenVBand="0" w:oddHBand="0" w:evenHBand="0" w:firstRowFirstColumn="0" w:firstRowLastColumn="0" w:lastRowFirstColumn="0" w:lastRowLastColumn="0"/>
+              <w:rPr>
+                <w:b/>
+                <w:bCs/>
+                <w:color w:val="FFFFFF" w:themeColor="background1"/>
+              </w:rPr>
             </w:pPr>
             <w:r>
+              <w:rPr>
+                <w:b/>
+                <w:bCs/>
+                <w:color w:val="FFFFFF" w:themeColor="background1"/>
+              </w:rPr>
               <w:t>Amount</w:t>
             </w:r>
           </w:p>
@@ -388,41 +415,73 @@
       </w:tr>
       <w:tr>
         <w:trPr>
-          <w:cnfStyle w:val="000000100000" w:firstRow="0" w:lastRow="0" w:firstColumn="0" w:lastColumn="0" w:oddVBand="0" w:evenVBand="0" w:oddHBand="1" w:evenHBand="0" w:firstRowFirstColumn="0" w:firstRowLastColumn="0" w:lastRowFirstColumn="0" w:lastRowLastColumn="0"/>
           <w:trHeight w:val="430"/>
         </w:trPr>
         <w:tc>
           <w:tcPr>
-            <w:cnfStyle w:val="001000000000" w:firstRow="0" w:lastRow="0" w:firstColumn="1" w:lastColumn="0" w:oddVBand="0" w:evenVBand="0" w:oddHBand="0" w:evenHBand="0" w:firstRowFirstColumn="0" w:firstRowLastColumn="0" w:lastRowFirstColumn="0" w:lastRowLastColumn="0"/>
             <w:tcW w:w="6020" w:type="dxa"/>
             <w:gridSpan w:val="2"/>
           </w:tcPr>
           <w:p>
+            <w:pPr>
+              <w:rPr>
+                <w:b/>
+                <w:bCs/>
+              </w:rPr>
+            </w:pPr>
             <w:proofErr w:type="gramStart"/>
             <w:r>
+              <w:rPr>
+                <w:b/>
+                <w:bCs/>
+              </w:rPr>
               <w:t>{{</w:t>
             </w:r>
             <w:r>
+              <w:rPr>
+                <w:b/>
+                <w:bCs/>
+              </w:rPr>
               <w:t xml:space="preserve"> </w:t>
             </w:r>
             <w:proofErr w:type="spellStart"/>
             <w:r>
+              <w:rPr>
+                <w:b/>
+                <w:bCs/>
+              </w:rPr>
               <w:t>current</w:t>
             </w:r>
             <w:proofErr w:type="gramEnd"/>
             <w:r>
+              <w:rPr>
+                <w:b/>
+                <w:bCs/>
+              </w:rPr>
               <w:t>_</w:t>
             </w:r>
             <w:proofErr w:type="gramStart"/>
             <w:r>
+              <w:rPr>
+                <w:b/>
+                <w:bCs/>
+              </w:rPr>
               <w:t>month</w:t>
             </w:r>
             <w:proofErr w:type="spellEnd"/>
             <w:r>
+              <w:rPr>
+                <w:b/>
+                <w:bCs/>
+              </w:rPr>
               <w:t xml:space="preserve"> }</w:t>
             </w:r>
             <w:proofErr w:type="gramEnd"/>
             <w:r>
+              <w:rPr>
+                <w:b/>
+                <w:bCs/>
+              </w:rPr>
               <w:t>} Consultant Fees</w:t>
             </w:r>
           </w:p>
@@ -435,7 +494,6 @@
           <w:p>
             <w:pPr>
               <w:jc w:val="right"/>
-              <w:cnfStyle w:val="000000100000" w:firstRow="0" w:lastRow="0" w:firstColumn="0" w:lastColumn="0" w:oddVBand="0" w:evenVBand="0" w:oddHBand="1" w:evenHBand="0" w:firstRowFirstColumn="0" w:firstRowLastColumn="0" w:lastRowFirstColumn="0" w:lastRowLastColumn="0"/>
             </w:pPr>
           </w:p>
         </w:tc>
@@ -446,7 +504,6 @@
           <w:p>
             <w:pPr>
               <w:jc w:val="right"/>
-              <w:cnfStyle w:val="000000100000" w:firstRow="0" w:lastRow="0" w:firstColumn="0" w:lastColumn="0" w:oddVBand="0" w:evenVBand="0" w:oddHBand="1" w:evenHBand="0" w:firstRowFirstColumn="0" w:firstRowLastColumn="0" w:lastRowFirstColumn="0" w:lastRowLastColumn="0"/>
             </w:pPr>
             <w:proofErr w:type="gramStart"/>
             <w:r>
@@ -947,7 +1004,6 @@
   <w:style w:type="table" w:default="1" w:styleId="TableNormal">
     <w:name w:val="Normal Table"/>
     <w:uiPriority w:val="99"/>
-    <w:semiHidden/>
     <w:unhideWhenUsed/>
     <w:tblPr>
       <w:tblInd w:w="0" w:type="dxa"/>

</xml_diff>

<commit_message>
feat(invoice): template with direct table formatting; drop the LibreOffice table workaround (#69)
The invoice template no longer relies on the Light List table style's banded
rules, so Word and LibreOffice draw the table the same way. Remove the
pre-processing added in #68 (and its tests); PDF conversion is back to plain
LibreOffice with the private profile.

Co-authored-by: Ahmed Ezzat <aezzat@voyancemed.com>
Co-authored-by: Claude Sonnet 5.5 <noreply@anthropic.com>
</commit_message>
<xml_diff>
--- a/docs/templates/us_invoice_template.docx
+++ b/docs/templates/us_invoice_template.docx
@@ -1,6 +1,6 @@
 
 <file path=word/document.xml><?xml version="1.0" encoding="utf-8"?>
-<w:document xmlns:wpc="http://schemas.microsoft.com/office/word/2010/wordprocessingCanvas" xmlns:cx="http://schemas.microsoft.com/office/drawing/2014/chartex" xmlns:cx1="http://schemas.microsoft.com/office/drawing/2015/9/8/chartex" xmlns:cx2="http://schemas.microsoft.com/office/drawing/2015/10/21/chartex" xmlns:cx3="http://schemas.microsoft.com/office/drawing/2016/5/9/chartex" xmlns:cx4="http://schemas.microsoft.com/office/drawing/2016/5/10/chartex" xmlns:cx5="http://schemas.microsoft.com/office/drawing/2016/5/11/chartex" xmlns:cx6="http://schemas.microsoft.com/office/drawing/2016/5/12/chartex" xmlns:cx7="http://schemas.microsoft.com/office/drawing/2016/5/13/chartex" xmlns:cx8="http://schemas.microsoft.com/office/drawing/2016/5/14/chartex" xmlns:mc="http://schemas.openxmlformats.org/markup-compatibility/2006" xmlns:aink="http://schemas.microsoft.com/office/drawing/2016/ink" xmlns:am3d="http://schemas.microsoft.com/office/drawing/2017/model3d" xmlns:o="urn:schemas-microsoft-com:office:office" xmlns:oel="http://schemas.microsoft.com/office/2019/extlst" xmlns:r="http://schemas.openxmlformats.org/officeDocument/2006/relationships" xmlns:m="http://schemas.openxmlformats.org/officeDocument/2006/math" xmlns:v="urn:schemas-microsoft-com:vml" xmlns:wp14="http://schemas.microsoft.com/office/word/2010/wordprocessingDrawing" xmlns:wp="http://schemas.openxmlformats.org/drawingml/2006/wordprocessingDrawing" xmlns:w10="urn:schemas-microsoft-com:office:word" xmlns:w="http://schemas.openxmlformats.org/wordprocessingml/2006/main" xmlns:w14="http://schemas.microsoft.com/office/word/2010/wordml" xmlns:w15="http://schemas.microsoft.com/office/word/2012/wordml" xmlns:w16cei="http://schemas.microsoft.com/office/word/2026/wordml/cei" xmlns:w16cex="http://schemas.microsoft.com/office/word/2018/wordml/cex" xmlns:w16cid="http://schemas.microsoft.com/office/word/2016/wordml/cid" xmlns:w16="http://schemas.microsoft.com/office/word/2018/wordml" xmlns:w16du="http://schemas.microsoft.com/office/word/2023/wordml/word16du" xmlns:w16sdtdh="http://schemas.microsoft.com/office/word/2020/wordml/sdtdatahash" xmlns:w16sdtfl="http://schemas.microsoft.com/office/word/2024/wordml/sdtformatlock" xmlns:w16se="http://schemas.microsoft.com/office/word/2015/wordml/symex" xmlns:wpg="http://schemas.microsoft.com/office/word/2010/wordprocessingGroup" xmlns:wpi="http://schemas.microsoft.com/office/word/2010/wordprocessingInk" xmlns:wne="http://schemas.microsoft.com/office/word/2006/wordml" xmlns:wps="http://schemas.microsoft.com/office/word/2010/wordprocessingShape" mc:Ignorable="w14 w15 w16se w16cid w16 w16cex w16sdtdh w16sdtfl w16du wp14">
+<w:document xmlns:wpc="http://schemas.microsoft.com/office/word/2010/wordprocessingCanvas" xmlns:cx="http://schemas.microsoft.com/office/drawing/2014/chartex" xmlns:cx1="http://schemas.microsoft.com/office/drawing/2015/9/8/chartex" xmlns:cx2="http://schemas.microsoft.com/office/drawing/2015/10/21/chartex" xmlns:cx3="http://schemas.microsoft.com/office/drawing/2016/5/9/chartex" xmlns:cx4="http://schemas.microsoft.com/office/drawing/2016/5/10/chartex" xmlns:cx5="http://schemas.microsoft.com/office/drawing/2016/5/11/chartex" xmlns:cx6="http://schemas.microsoft.com/office/drawing/2016/5/12/chartex" xmlns:cx7="http://schemas.microsoft.com/office/drawing/2016/5/13/chartex" xmlns:cx8="http://schemas.microsoft.com/office/drawing/2016/5/14/chartex" xmlns:mc="http://schemas.openxmlformats.org/markup-compatibility/2006" xmlns:aink="http://schemas.microsoft.com/office/drawing/2016/ink" xmlns:am3d="http://schemas.microsoft.com/office/drawing/2017/model3d" xmlns:o="urn:schemas-microsoft-com:office:office" xmlns:oel="http://schemas.microsoft.com/office/2019/extlst" xmlns:r="http://schemas.openxmlformats.org/officeDocument/2006/relationships" xmlns:m="http://schemas.openxmlformats.org/officeDocument/2006/math" xmlns:v="urn:schemas-microsoft-com:vml" xmlns:wp14="http://schemas.microsoft.com/office/word/2010/wordprocessingDrawing" xmlns:wp="http://schemas.openxmlformats.org/drawingml/2006/wordprocessingDrawing" xmlns:w10="urn:schemas-microsoft-com:office:word" xmlns:w="http://schemas.openxmlformats.org/wordprocessingml/2006/main" xmlns:w14="http://schemas.microsoft.com/office/word/2010/wordml" xmlns:w15="http://schemas.microsoft.com/office/word/2012/wordml" xmlns:w16cex="http://schemas.microsoft.com/office/word/2018/wordml/cex" xmlns:w16cid="http://schemas.microsoft.com/office/word/2016/wordml/cid" xmlns:w16="http://schemas.microsoft.com/office/word/2018/wordml" xmlns:w16du="http://schemas.microsoft.com/office/word/2023/wordml/word16du" xmlns:w16sdtdh="http://schemas.microsoft.com/office/word/2020/wordml/sdtdatahash" xmlns:w16sdtfl="http://schemas.microsoft.com/office/word/2024/wordml/sdtformatlock" xmlns:w16se="http://schemas.microsoft.com/office/word/2015/wordml/symex" xmlns:wpg="http://schemas.microsoft.com/office/word/2010/wordprocessingGroup" xmlns:wpi="http://schemas.microsoft.com/office/word/2010/wordprocessingInk" xmlns:wne="http://schemas.microsoft.com/office/word/2006/wordml" xmlns:wps="http://schemas.microsoft.com/office/word/2010/wordprocessingShape" mc:Ignorable="w14 w15 w16se w16cid w16 w16cex w16sdtdh w16sdtfl w16du wp14">
   <w:body>
     <w:p>
       <w:pPr>
@@ -328,28 +328,42 @@
     <w:p/>
     <w:tbl>
       <w:tblPr>
-        <w:tblStyle w:val="LightList-Accent1"/>
         <w:tblW w:w="0" w:type="auto"/>
+        <w:tblBorders>
+          <w:top w:val="single" w:sz="12" w:space="0" w:color="4F81BD"/>
+          <w:left w:val="single" w:sz="12" w:space="0" w:color="4F81BD"/>
+          <w:bottom w:val="single" w:sz="12" w:space="0" w:color="4F81BD"/>
+          <w:right w:val="single" w:sz="12" w:space="0" w:color="4F81BD"/>
+        </w:tblBorders>
         <w:tblLook w:val="04A0" w:firstRow="1" w:lastRow="0" w:firstColumn="1" w:lastColumn="0" w:noHBand="0" w:noVBand="1"/>
       </w:tblPr>
       <w:tblGrid>
-        <w:gridCol w:w="5660"/>
+        <w:gridCol w:w="5654"/>
         <w:gridCol w:w="360"/>
-        <w:gridCol w:w="1381"/>
+        <w:gridCol w:w="1379"/>
         <w:gridCol w:w="59"/>
-        <w:gridCol w:w="2600"/>
+        <w:gridCol w:w="2598"/>
       </w:tblGrid>
       <w:tr>
-        <w:trPr>
-          <w:cnfStyle w:val="100000000000" w:firstRow="1" w:lastRow="0" w:firstColumn="0" w:lastColumn="0" w:oddVBand="0" w:evenVBand="0" w:oddHBand="0" w:evenHBand="0" w:firstRowFirstColumn="0" w:firstRowLastColumn="0" w:lastRowFirstColumn="0" w:lastRowLastColumn="0"/>
-        </w:trPr>
         <w:tc>
           <w:tcPr>
-            <w:cnfStyle w:val="001000000000" w:firstRow="0" w:lastRow="0" w:firstColumn="1" w:lastColumn="0" w:oddVBand="0" w:evenVBand="0" w:oddHBand="0" w:evenHBand="0" w:firstRowFirstColumn="0" w:firstRowLastColumn="0" w:lastRowFirstColumn="0" w:lastRowLastColumn="0"/>
             <w:tcW w:w="5660" w:type="dxa"/>
+            <w:shd w:val="clear" w:color="auto" w:fill="4F81BD"/>
           </w:tcPr>
           <w:p>
-            <w:r>
+            <w:pPr>
+              <w:rPr>
+                <w:b/>
+                <w:bCs/>
+                <w:color w:val="FFFFFF" w:themeColor="background1"/>
+              </w:rPr>
+            </w:pPr>
+            <w:r>
+              <w:rPr>
+                <w:b/>
+                <w:bCs/>
+                <w:color w:val="FFFFFF" w:themeColor="background1"/>
+              </w:rPr>
               <w:t>Name</w:t>
             </w:r>
           </w:p>
@@ -358,12 +372,15 @@
           <w:tcPr>
             <w:tcW w:w="1741" w:type="dxa"/>
             <w:gridSpan w:val="2"/>
+            <w:shd w:val="clear" w:color="auto" w:fill="4F81BD"/>
           </w:tcPr>
           <w:p>
             <w:pPr>
               <w:jc w:val="right"/>
-              <w:cnfStyle w:val="100000000000" w:firstRow="1" w:lastRow="0" w:firstColumn="0" w:lastColumn="0" w:oddVBand="0" w:evenVBand="0" w:oddHBand="0" w:evenHBand="0" w:firstRowFirstColumn="0" w:firstRowLastColumn="0" w:lastRowFirstColumn="0" w:lastRowLastColumn="0"/>
               <w:rPr>
+                <w:b/>
+                <w:bCs/>
+                <w:color w:val="FFFFFF" w:themeColor="background1"/>
                 <w:sz w:val="20"/>
                 <w:szCs w:val="14"/>
               </w:rPr>
@@ -374,13 +391,23 @@
           <w:tcPr>
             <w:tcW w:w="2659" w:type="dxa"/>
             <w:gridSpan w:val="2"/>
+            <w:shd w:val="clear" w:color="auto" w:fill="4F81BD"/>
           </w:tcPr>
           <w:p>
             <w:pPr>
               <w:jc w:val="right"/>
-              <w:cnfStyle w:val="100000000000" w:firstRow="1" w:lastRow="0" w:firstColumn="0" w:lastColumn="0" w:oddVBand="0" w:evenVBand="0" w:oddHBand="0" w:evenHBand="0" w:firstRowFirstColumn="0" w:firstRowLastColumn="0" w:lastRowFirstColumn="0" w:lastRowLastColumn="0"/>
+              <w:rPr>
+                <w:b/>
+                <w:bCs/>
+                <w:color w:val="FFFFFF" w:themeColor="background1"/>
+              </w:rPr>
             </w:pPr>
             <w:r>
+              <w:rPr>
+                <w:b/>
+                <w:bCs/>
+                <w:color w:val="FFFFFF" w:themeColor="background1"/>
+              </w:rPr>
               <w:t>Amount</w:t>
             </w:r>
           </w:p>
@@ -388,41 +415,73 @@
       </w:tr>
       <w:tr>
         <w:trPr>
-          <w:cnfStyle w:val="000000100000" w:firstRow="0" w:lastRow="0" w:firstColumn="0" w:lastColumn="0" w:oddVBand="0" w:evenVBand="0" w:oddHBand="1" w:evenHBand="0" w:firstRowFirstColumn="0" w:firstRowLastColumn="0" w:lastRowFirstColumn="0" w:lastRowLastColumn="0"/>
           <w:trHeight w:val="430"/>
         </w:trPr>
         <w:tc>
           <w:tcPr>
-            <w:cnfStyle w:val="001000000000" w:firstRow="0" w:lastRow="0" w:firstColumn="1" w:lastColumn="0" w:oddVBand="0" w:evenVBand="0" w:oddHBand="0" w:evenHBand="0" w:firstRowFirstColumn="0" w:firstRowLastColumn="0" w:lastRowFirstColumn="0" w:lastRowLastColumn="0"/>
             <w:tcW w:w="6020" w:type="dxa"/>
             <w:gridSpan w:val="2"/>
           </w:tcPr>
           <w:p>
+            <w:pPr>
+              <w:rPr>
+                <w:b/>
+                <w:bCs/>
+              </w:rPr>
+            </w:pPr>
             <w:proofErr w:type="gramStart"/>
             <w:r>
+              <w:rPr>
+                <w:b/>
+                <w:bCs/>
+              </w:rPr>
               <w:t>{{</w:t>
             </w:r>
             <w:r>
+              <w:rPr>
+                <w:b/>
+                <w:bCs/>
+              </w:rPr>
               <w:t xml:space="preserve"> </w:t>
             </w:r>
             <w:proofErr w:type="spellStart"/>
             <w:r>
+              <w:rPr>
+                <w:b/>
+                <w:bCs/>
+              </w:rPr>
               <w:t>current</w:t>
             </w:r>
             <w:proofErr w:type="gramEnd"/>
             <w:r>
+              <w:rPr>
+                <w:b/>
+                <w:bCs/>
+              </w:rPr>
               <w:t>_</w:t>
             </w:r>
             <w:proofErr w:type="gramStart"/>
             <w:r>
+              <w:rPr>
+                <w:b/>
+                <w:bCs/>
+              </w:rPr>
               <w:t>month</w:t>
             </w:r>
             <w:proofErr w:type="spellEnd"/>
             <w:r>
+              <w:rPr>
+                <w:b/>
+                <w:bCs/>
+              </w:rPr>
               <w:t xml:space="preserve"> }</w:t>
             </w:r>
             <w:proofErr w:type="gramEnd"/>
             <w:r>
+              <w:rPr>
+                <w:b/>
+                <w:bCs/>
+              </w:rPr>
               <w:t>} Consultant Fees</w:t>
             </w:r>
           </w:p>
@@ -435,7 +494,6 @@
           <w:p>
             <w:pPr>
               <w:jc w:val="right"/>
-              <w:cnfStyle w:val="000000100000" w:firstRow="0" w:lastRow="0" w:firstColumn="0" w:lastColumn="0" w:oddVBand="0" w:evenVBand="0" w:oddHBand="1" w:evenHBand="0" w:firstRowFirstColumn="0" w:firstRowLastColumn="0" w:lastRowFirstColumn="0" w:lastRowLastColumn="0"/>
             </w:pPr>
           </w:p>
         </w:tc>
@@ -446,7 +504,6 @@
           <w:p>
             <w:pPr>
               <w:jc w:val="right"/>
-              <w:cnfStyle w:val="000000100000" w:firstRow="0" w:lastRow="0" w:firstColumn="0" w:lastColumn="0" w:oddVBand="0" w:evenVBand="0" w:oddHBand="1" w:evenHBand="0" w:firstRowFirstColumn="0" w:firstRowLastColumn="0" w:lastRowFirstColumn="0" w:lastRowLastColumn="0"/>
             </w:pPr>
             <w:proofErr w:type="gramStart"/>
             <w:r>
@@ -947,7 +1004,6 @@
   <w:style w:type="table" w:default="1" w:styleId="TableNormal">
     <w:name w:val="Normal Table"/>
     <w:uiPriority w:val="99"/>
-    <w:semiHidden/>
     <w:unhideWhenUsed/>
     <w:tblPr>
       <w:tblInd w:w="0" w:type="dxa"/>

</xml_diff>